<commit_message>
fix fonts for libre office compatibility
</commit_message>
<xml_diff>
--- a/templates/BRGY-BLD.docx
+++ b/templates/BRGY-BLD.docx
@@ -1409,6 +1409,7 @@
                               <w:spacing w:after="0"/>
                               <w:jc w:val="center"/>
                               <w:rPr>
+                                <w:rFonts w:ascii="Times New Roman" w:hAnsi="Times New Roman" w:cs="Times New Roman"/>
                                 <w:sz w:val="24"/>
                                 <w:szCs w:val="24"/>
                                 <w:u w:val="single"/>
@@ -1416,6 +1417,7 @@
                             </w:pPr>
                             <w:r>
                               <w:rPr>
+                                <w:rFonts w:ascii="Times New Roman" w:hAnsi="Times New Roman" w:cs="Times New Roman"/>
                                 <w:sz w:val="24"/>
                                 <w:szCs w:val="24"/>
                                 <w:u w:val="single"/>
@@ -1423,9 +1425,9 @@
                               <w:t>{</w:t>
                             </w:r>
                             <w:proofErr w:type="spellStart"/>
-                            <w:proofErr w:type="gramStart"/>
-                            <w:r>
-                              <w:rPr>
+                            <w:r>
+                              <w:rPr>
+                                <w:rFonts w:ascii="Times New Roman" w:hAnsi="Times New Roman" w:cs="Times New Roman"/>
                                 <w:sz w:val="24"/>
                                 <w:szCs w:val="24"/>
                                 <w:u w:val="single"/>
@@ -1433,9 +1435,9 @@
                               <w:t>d.date</w:t>
                             </w:r>
                             <w:proofErr w:type="spellEnd"/>
-                            <w:proofErr w:type="gramEnd"/>
-                            <w:r>
-                              <w:rPr>
+                            <w:r>
+                              <w:rPr>
+                                <w:rFonts w:ascii="Times New Roman" w:hAnsi="Times New Roman" w:cs="Times New Roman"/>
                                 <w:sz w:val="24"/>
                                 <w:szCs w:val="24"/>
                                 <w:u w:val="single"/>
@@ -1448,12 +1450,14 @@
                               <w:spacing w:after="0"/>
                               <w:jc w:val="center"/>
                               <w:rPr>
+                                <w:rFonts w:ascii="Times New Roman" w:hAnsi="Times New Roman" w:cs="Times New Roman"/>
                                 <w:sz w:val="24"/>
                                 <w:szCs w:val="24"/>
                               </w:rPr>
                             </w:pPr>
                             <w:r>
                               <w:rPr>
+                                <w:rFonts w:ascii="Times New Roman" w:hAnsi="Times New Roman" w:cs="Times New Roman"/>
                                 <w:sz w:val="24"/>
                                 <w:szCs w:val="24"/>
                               </w:rPr>
@@ -1487,6 +1491,7 @@
                         <w:spacing w:after="0"/>
                         <w:jc w:val="center"/>
                         <w:rPr>
+                          <w:rFonts w:ascii="Times New Roman" w:hAnsi="Times New Roman" w:cs="Times New Roman"/>
                           <w:sz w:val="24"/>
                           <w:szCs w:val="24"/>
                           <w:u w:val="single"/>
@@ -1494,6 +1499,7 @@
                       </w:pPr>
                       <w:r>
                         <w:rPr>
+                          <w:rFonts w:ascii="Times New Roman" w:hAnsi="Times New Roman" w:cs="Times New Roman"/>
                           <w:sz w:val="24"/>
                           <w:szCs w:val="24"/>
                           <w:u w:val="single"/>
@@ -1501,9 +1507,9 @@
                         <w:t>{</w:t>
                       </w:r>
                       <w:proofErr w:type="spellStart"/>
-                      <w:proofErr w:type="gramStart"/>
-                      <w:r>
-                        <w:rPr>
+                      <w:r>
+                        <w:rPr>
+                          <w:rFonts w:ascii="Times New Roman" w:hAnsi="Times New Roman" w:cs="Times New Roman"/>
                           <w:sz w:val="24"/>
                           <w:szCs w:val="24"/>
                           <w:u w:val="single"/>
@@ -1511,9 +1517,9 @@
                         <w:t>d.date</w:t>
                       </w:r>
                       <w:proofErr w:type="spellEnd"/>
-                      <w:proofErr w:type="gramEnd"/>
-                      <w:r>
-                        <w:rPr>
+                      <w:r>
+                        <w:rPr>
+                          <w:rFonts w:ascii="Times New Roman" w:hAnsi="Times New Roman" w:cs="Times New Roman"/>
                           <w:sz w:val="24"/>
                           <w:szCs w:val="24"/>
                           <w:u w:val="single"/>
@@ -1526,12 +1532,14 @@
                         <w:spacing w:after="0"/>
                         <w:jc w:val="center"/>
                         <w:rPr>
+                          <w:rFonts w:ascii="Times New Roman" w:hAnsi="Times New Roman" w:cs="Times New Roman"/>
                           <w:sz w:val="24"/>
                           <w:szCs w:val="24"/>
                         </w:rPr>
                       </w:pPr>
                       <w:r>
                         <w:rPr>
+                          <w:rFonts w:ascii="Times New Roman" w:hAnsi="Times New Roman" w:cs="Times New Roman"/>
                           <w:sz w:val="24"/>
                           <w:szCs w:val="24"/>
                         </w:rPr>
@@ -2123,35 +2131,17 @@
           <w:szCs w:val="38"/>
         </w:rPr>
         <w:drawing>
-          <wp:anchor distT="0" distB="0" distL="114300" distR="114300" simplePos="0" relativeHeight="251663360" behindDoc="0" locked="0" layoutInCell="1" allowOverlap="1" wp14:anchorId="29023007" wp14:editId="111162BC">
+          <wp:anchor distT="0" distB="0" distL="114300" distR="114300" simplePos="0" relativeHeight="251663360" behindDoc="0" locked="0" layoutInCell="1" allowOverlap="1" wp14:anchorId="29023007" wp14:editId="7197F471">
             <wp:simplePos x="0" y="0"/>
             <wp:positionH relativeFrom="page">
-              <wp:posOffset>6048375</wp:posOffset>
+              <wp:posOffset>6049926</wp:posOffset>
             </wp:positionH>
             <wp:positionV relativeFrom="page">
-              <wp:posOffset>7496175</wp:posOffset>
+              <wp:posOffset>7495953</wp:posOffset>
             </wp:positionV>
             <wp:extent cx="1595120" cy="1272540"/>
             <wp:effectExtent l="0" t="0" r="0" b="3810"/>
-            <wp:wrapThrough wrapText="bothSides">
-              <wp:wrapPolygon edited="0">
-                <wp:start x="11024" y="21277"/>
-                <wp:lineTo x="12571" y="19660"/>
-                <wp:lineTo x="13603" y="17720"/>
-                <wp:lineTo x="13603" y="15456"/>
-                <wp:lineTo x="18246" y="10283"/>
-                <wp:lineTo x="19794" y="3169"/>
-                <wp:lineTo x="20310" y="259"/>
-                <wp:lineTo x="963" y="259"/>
-                <wp:lineTo x="705" y="259"/>
-                <wp:lineTo x="3285" y="10283"/>
-                <wp:lineTo x="7154" y="15456"/>
-                <wp:lineTo x="6896" y="17073"/>
-                <wp:lineTo x="8186" y="19983"/>
-                <wp:lineTo x="9476" y="21277"/>
-                <wp:lineTo x="11024" y="21277"/>
-              </wp:wrapPolygon>
-            </wp:wrapThrough>
+            <wp:wrapNone/>
             <wp:docPr id="542692796" name="Picture 39"/>
             <wp:cNvGraphicFramePr>
               <a:graphicFrameLocks xmlns:a="http://schemas.openxmlformats.org/drawingml/2006/main" noChangeAspect="1"/>

</xml_diff>